<commit_message>
feat(desktop): align default DOCX export with the web-exported reference
Patch the packaged reference.docx to match the web-exported target
document: theme fonts SimSun (CJK) / Calibri headings + Cambria body
(Latin), accent-blue 4F81BD headings, bold H1-H3 + italic H4, H1 spacing
480/0 and H2-H4 200/0, H3/H4 inheriting the body size. Also drop the
HTML <title> in the pandoc path so the export no longer emits a
duplicate Title paragraph above the document's own H1.
</commit_message>
<xml_diff>
--- a/packages/desktop/static/reference.docx
+++ b/packages/desktop/static/reference.docx
@@ -465,7 +465,7 @@
     <w:rPr>
       <w:rFonts w:asciiTheme="majorHAnsi" w:cstheme="majorBidi" w:eastAsiaTheme="majorEastAsia" w:hAnsiTheme="majorHAnsi"/>
       <w:b/>
-      <w:color w:val="auto"/>
+      <w:color w:themeColor="accent1" w:val="4F81BD"/>
       <w:sz w:val="32"/>
       <w:szCs w:val="32"/>
     </w:rPr>
@@ -489,7 +489,7 @@
     <w:rPr>
       <w:rFonts w:asciiTheme="majorHAnsi" w:cstheme="majorBidi" w:eastAsiaTheme="majorEastAsia" w:hAnsiTheme="majorHAnsi"/>
       <w:b/>
-      <w:color w:val="auto"/>
+      <w:color w:themeColor="accent1" w:val="4F81BD"/>
       <w:sz w:val="28"/>
       <w:szCs w:val="28"/>
     </w:rPr>
@@ -511,11 +511,9 @@
       <w:outlineLvl w:val="2"/>
     </w:pPr>
     <w:rPr>
-      <w:rFonts w:cstheme="majorBidi" w:eastAsiaTheme="majorEastAsia"/>
+      <w:rFonts w:asciiTheme="majorHAnsi" w:cstheme="majorBidi" w:eastAsiaTheme="majorEastAsia" w:hAnsiTheme="majorHAnsi"/>
       <w:b/>
-      <w:color w:val="auto"/>
-      <w:sz w:val="26"/>
-      <w:szCs w:val="26"/>
+      <w:color w:themeColor="accent1" w:val="4F81BD"/>
     </w:rPr>
   </w:style>
   <w:style w:styleId="Heading4" w:type="paragraph">
@@ -531,14 +529,15 @@
     <w:pPr>
       <w:keepNext/>
       <w:keepLines/>
-      <w:spacing w:after="40" w:before="80"/>
+      <w:spacing w:after="0" w:before="200"/>
       <w:outlineLvl w:val="3"/>
     </w:pPr>
     <w:rPr>
-      <w:rFonts w:cstheme="majorBidi" w:eastAsiaTheme="majorEastAsia"/>
+      <w:rFonts w:asciiTheme="majorHAnsi" w:cstheme="majorBidi" w:eastAsiaTheme="majorEastAsia" w:hAnsiTheme="majorHAnsi"/>
+      <w:bCs/>
       <w:i/>
       <w:iCs/>
-      <w:color w:val="auto"/>
+      <w:color w:themeColor="accent1" w:val="4F81BD"/>
     </w:rPr>
   </w:style>
   <w:style w:styleId="Heading5" w:type="paragraph">
@@ -1257,12 +1256,12 @@
     </a:clrScheme>
     <a:fontScheme name="Office">
       <a:majorFont>
-        <a:latin typeface="Times New Roman"/>
+        <a:latin typeface="Calibri"/>
         <a:ea typeface=""/>
         <a:cs typeface=""/>
         <a:font script="Jpan" typeface="游ゴシック Light"/>
         <a:font script="Hang" typeface="맑은 고딕"/>
-        <a:font script="Hans" typeface="等线 Light"/>
+        <a:font script="Hans" typeface="宋体"/>
         <a:font script="Hant" typeface="新細明體"/>
         <a:font script="Arab" typeface="Times New Roman"/>
         <a:font script="Hebr" typeface="Times New Roman"/>
@@ -1309,12 +1308,12 @@
         <a:font script="Tfng" typeface="Ebrima"/>
       </a:majorFont>
       <a:minorFont>
-        <a:latin typeface="Times New Roman"/>
+        <a:latin typeface="Cambria"/>
         <a:ea typeface=""/>
         <a:cs typeface=""/>
         <a:font script="Jpan" typeface="游明朝"/>
         <a:font script="Hang" typeface="맑은 고딕"/>
-        <a:font script="Hans" typeface="等线"/>
+        <a:font script="Hans" typeface="宋体"/>
         <a:font script="Hant" typeface="新細明體"/>
         <a:font script="Arab" typeface="Arial"/>
         <a:font script="Hebr" typeface="Arial"/>

</xml_diff>